<commit_message>
Add Open Invoices as-of-date export rule to START HERE docs
Co-Authored-By: Claude Opus 4.8 <noreply@anthropic.com>
</commit_message>
<xml_diff>
--- a/Industrial Pipe & Supply — Secure File Drop (QuickBooks exports)-20260610T045505Z-3-001/Industrial Pipe & Supply — Secure File Drop (QuickBooks exports)/START HERE — QuickBooks Export Steps (English).docx
+++ b/Industrial Pipe & Supply — Secure File Drop (QuickBooks exports)-20260610T045505Z-3-001/Industrial Pipe & Supply — Secure File Drop (QuickBooks exports)/START HERE — QuickBooks Export Steps (English).docx
@@ -1874,6 +1874,59 @@
           <w:rtl w:val="0"/>
         </w:rPr>
         <w:t xml:space="preserve">2.  Leave the minus numbers alone on Open Invoices.</w:t>
+      </w:r>
+    </w:p>
+    <w:p>
+      <w:pPr>
+        <w:keepNext w:val="0"/>
+        <w:keepLines w:val="0"/>
+        <w:pageBreakBefore w:val="0"/>
+        <w:widowControl w:val="0"/>
+        <w:pBdr>
+          <w:top w:space="0" w:sz="0" w:val="nil"/>
+          <w:left w:space="0" w:sz="0" w:val="nil"/>
+          <w:bottom w:space="0" w:sz="0" w:val="nil"/>
+          <w:right w:space="0" w:sz="0" w:val="nil"/>
+          <w:between w:space="0" w:sz="0" w:val="nil"/>
+        </w:pBdr>
+        <w:shd w:fill="auto" w:val="clear"/>
+        <w:spacing w:after="0" w:before="0" w:line="276" w:lineRule="auto"/>
+        <w:ind w:left="0" w:right="0" w:firstLine="0"/>
+        <w:jc w:val="left"/>
+        <w:rPr>
+          <w:rFonts w:ascii="Arial" w:cs="Arial" w:eastAsia="Arial" w:hAnsi="Arial"/>
+          <w:b w:val="0"/>
+          <w:bCs w:val="0"/>
+          <w:i w:val="0"/>
+          <w:iCs w:val="0"/>
+          <w:smallCaps w:val="0"/>
+          <w:strike w:val="0"/>
+          <w:color w:val="000000"/>
+          <w:sz w:val="22"/>
+          <w:szCs w:val="22"/>
+          <w:u w:val="none"/>
+          <w:shd w:fill="auto" w:val="clear"/>
+          <w:vertAlign w:val="baseline"/>
+        </w:rPr>
+      </w:pPr>
+      <w:r>
+        <w:rPr>
+          <w:rFonts w:ascii="Arial" w:cs="Arial" w:eastAsia="Arial" w:hAnsi="Arial"/>
+          <w:b w:val="0"/>
+          <w:bCs w:val="0"/>
+          <w:i w:val="0"/>
+          <w:iCs w:val="0"/>
+          <w:smallCaps w:val="0"/>
+          <w:strike w:val="0"/>
+          <w:color w:val="000000"/>
+          <w:sz w:val="22"/>
+          <w:szCs w:val="22"/>
+          <w:u w:val="none"/>
+          <w:shd w:fill="auto" w:val="clear"/>
+          <w:vertAlign w:val="baseline"/>
+          <w:rtl w:val="0"/>
+        </w:rPr>
+        <w:t>3.  Export Open Invoices on the as-of date itself, ideally the last business day of the month. QuickBooks shows only invoices still open at the moment you run it, so exporting later drops recently paid invoices and the totals stop matching the other three reports.</w:t>
       </w:r>
     </w:p>
     <w:p>

</xml_diff>